<commit_message>
docs(pz16): verify Word report pagination
</commit_message>
<xml_diff>
--- a/reports/word/pz16.docx
+++ b/reports/word/pz16.docx
@@ -339,7 +339,7 @@
     <w:p>
       <w:pPr/>
       <w:r>
-        <w:t>Скрипт подключает setup.ps1, проверяет Docker, создаёт уникальный Compose project, пароль в памяти и собственный том. Docker сам выделяет loopback-порт. После healthcheck тесты получают временный DSN через окружение процесса. Пароль и DSN не печатаются, не записываются на диск; окружение восстанавливается в finally. Каждый тест создаёт собственную случайную схему it_&lt;token&gt; и задаёт search_path всем подключениям своего пула. Фикстуры создаются через HTTP POST; t.Cleanup закрывает сервер и пул, удаляет только свою схему. Нет TRUNCATE общих таблиц и зависимости от порядка. Требуются маркер собственного проекта, loopback и тестовая БД notes_test; без параметров тесты получают FAIL, не SKIP.</w:t>
+        <w:t>Скрипт подключает setup.ps1, проверяет Docker, создаёт уникальный Compose project, временный пароль и собственный том. Docker сам выделяет loopback-порт. После healthcheck тесты получают временный DSN через окружение процесса. Пароль и DSN не печатаются и не сохраняются в репозитории или отчётных логах; пароль передаётся Docker как переменная окружения одноразового контейнера. Окружение PowerShell восстанавливается в finally, а контейнер и том удаляются. Каждый тест создаёт собственную случайную схему it_&lt;token&gt; и задаёт search_path всем подключениям своего пула. Фикстуры создаются через HTTP POST; t.Cleanup закрывает сервер и пул, удаляет только свою схему. Нет TRUNCATE общих таблиц и зависимости от порядка. Требуются маркер собственного проекта, loopback и тестовая БД notes_test; без параметров тесты получают FAIL, не SKIP.</w:t>
       </w:r>
     </w:p>
     <w:p>
@@ -1461,7 +1461,7 @@
         <w:t>python scripts/export_reports_docx.py pz16</w:t>
       </w:r>
       <w:r>
-        <w:t xml:space="preserve"> после окончательной правки Markdown. Сверены все текстовые фрагменты, семь ответов, таблицы, формат A4, стили и пустые персональные свойства. </w:t>
+        <w:t xml:space="preserve"> после окончательной правки Markdown. Сверены текст, семь ответов, таблицы, формат A4, стили и пустые персональные свойства. Отчёт постранично отрисован через LibreOffice и проверен на четырёх страницах: обрезанного текста и нарушенных таблиц нет. </w:t>
       </w:r>
       <w:hyperlink r:id="rId18">
         <w:r>
@@ -1472,7 +1472,7 @@
         </w:r>
       </w:hyperlink>
       <w:r>
-        <w:t>. Попытка render_docx.py завершилась ошибкой отсутствия soffice.exe; постраничная визуальная проверка недоступна без LibreOffice/Word.</w:t>
+        <w:t>.</w:t>
       </w:r>
     </w:p>
     <w:p>

</xml_diff>